<commit_message>
Final pricing: BBA Tech, payment terms, 6mo free maintenance
</commit_message>
<xml_diff>
--- a/BBA_Aerosmart_Pricing.docx
+++ b/BBA_Aerosmart_Pricing.docx
@@ -19,7 +19,7 @@
           <w:color w:val="B8922F"/>
           <w:sz w:val="72"/>
         </w:rPr>
-        <w:t>BBA TEKNOLOJi</w:t>
+        <w:t>BBA TECH</w:t>
       </w:r>
     </w:p>
     <w:p>
@@ -89,6 +89,8 @@
           <w:sz w:val="20"/>
         </w:rPr>
         <w:t>serdarbatkan@bbateknoloji.com | +90 534 431 87 34</w:t>
+        <w:br/>
+        <w:t>www.bbaflighthub.com</w:t>
       </w:r>
     </w:p>
     <w:p>
@@ -104,12 +106,12 @@
         <w:rPr>
           <w:color w:val="1A1A1A"/>
         </w:rPr>
-        <w:t>Option A — One-Time License</w:t>
+        <w:t>Algorithm Pricing</w:t>
       </w:r>
     </w:p>
     <w:p>
       <w:r>
-        <w:t>Individual algorithm pricing. Each algorithm is delivered, deployed, and licensed permanently. Algorithms can be purchased individually or as a full package with discount.</w:t>
+        <w:t>Each algorithm can be purchased individually or as a full package with discount.</w:t>
       </w:r>
     </w:p>
     <w:tbl>
@@ -155,7 +157,7 @@
                 <w:color w:val="FFFFFF"/>
                 <w:sz w:val="20"/>
               </w:rPr>
-              <w:t>Use Case</w:t>
+              <w:t>Algorithm</w:t>
             </w:r>
           </w:p>
         </w:tc>
@@ -1110,7 +1112,7 @@
                 <w:b/>
                 <w:sz w:val="22"/>
               </w:rPr>
-              <w:t>Total (Individual)</w:t>
+              <w:t>Total (Individual Pricing)</w:t>
             </w:r>
           </w:p>
         </w:tc>
@@ -1143,7 +1145,7 @@
                 <w:color w:val="2D8A4E"/>
                 <w:sz w:val="24"/>
               </w:rPr>
-              <w:t>Full Package Discount (All 13 + Integration)</w:t>
+              <w:t>Full Package (All 13 Algorithms + Integration)</w:t>
             </w:r>
           </w:p>
         </w:tc>
@@ -1172,14 +1174,14 @@
           <w:color w:val="666666"/>
           <w:sz w:val="20"/>
         </w:rPr>
-        <w:t xml:space="preserve">Full package saves $5,500 (15% discount). </w:t>
-      </w:r>
-      <w:r>
-        <w:t>One-time license includes delivery, deployment, and 30-day bug fix warranty.</w:t>
+        <w:t>Full package saves $5,500 (15% discount).</w:t>
       </w:r>
     </w:p>
-    <w:p/>
-    <w:p/>
+    <w:p>
+      <w:r>
+        <w:br w:type="page"/>
+      </w:r>
+    </w:p>
     <w:p>
       <w:pPr>
         <w:pStyle w:val="Heading1"/>
@@ -1188,14 +1190,20 @@
         <w:rPr>
           <w:color w:val="1A1A1A"/>
         </w:rPr>
-        <w:t>Option B — Monthly Subscription (Recommended)</w:t>
+        <w:t>AI Update &amp; Maintenance Plans</w:t>
       </w:r>
     </w:p>
     <w:p>
       <w:r>
-        <w:t>Monthly subscription includes all algorithms, continuous AI model updates, performance improvements, and new feature releases. Cancel anytime — existing version continues to work, updates stop.</w:t>
+        <w:rPr>
+          <w:b/>
+          <w:color w:val="2D8A4E"/>
+          <w:sz w:val="24"/>
+        </w:rPr>
+        <w:t>First 6 months included free with any full package purchase.</w:t>
       </w:r>
     </w:p>
+    <w:p/>
     <w:tbl>
       <w:tblPr>
         <w:tblStyle w:val="TableGrid"/>
@@ -1222,7 +1230,7 @@
                 <w:color w:val="FFFFFF"/>
                 <w:sz w:val="20"/>
               </w:rPr>
-              <w:t>Plan</w:t>
+              <w:t>Feature</w:t>
             </w:r>
           </w:p>
         </w:tc>
@@ -1239,7 +1247,7 @@
                 <w:color w:val="FFFFFF"/>
                 <w:sz w:val="20"/>
               </w:rPr>
-              <w:t>Includes</w:t>
+              <w:t>Standard — $800/mo</w:t>
             </w:r>
           </w:p>
         </w:tc>
@@ -1256,7 +1264,7 @@
                 <w:color w:val="FFFFFF"/>
                 <w:sz w:val="20"/>
               </w:rPr>
-              <w:t>Monthly Price</w:t>
+              <w:t>Premium — $1,200/mo</w:t>
             </w:r>
           </w:p>
         </w:tc>
@@ -1272,7 +1280,7 @@
               <w:rPr>
                 <w:sz w:val="20"/>
               </w:rPr>
-              <w:t>Starter</w:t>
+              <w:t>Bug Fixes</w:t>
             </w:r>
           </w:p>
         </w:tc>
@@ -1286,7 +1294,7 @@
               <w:rPr>
                 <w:sz w:val="20"/>
               </w:rPr>
-              <w:t>Phase 1 — 5 algorithms</w:t>
+              <w:t>✓</w:t>
             </w:r>
           </w:p>
         </w:tc>
@@ -1300,7 +1308,7 @@
               <w:rPr>
                 <w:sz w:val="20"/>
               </w:rPr>
-              <w:t>$1,200 /month</w:t>
+              <w:t>✓</w:t>
             </w:r>
           </w:p>
         </w:tc>
@@ -1316,7 +1324,7 @@
               <w:rPr>
                 <w:sz w:val="20"/>
               </w:rPr>
-              <w:t>Professional</w:t>
+              <w:t>FH2 Compatibility Updates</w:t>
             </w:r>
           </w:p>
         </w:tc>
@@ -1330,7 +1338,7 @@
               <w:rPr>
                 <w:sz w:val="20"/>
               </w:rPr>
-              <w:t>Phase 1 + 2 — 9 algorithms</w:t>
+              <w:t>✓</w:t>
             </w:r>
           </w:p>
         </w:tc>
@@ -1344,7 +1352,7 @@
               <w:rPr>
                 <w:sz w:val="20"/>
               </w:rPr>
-              <w:t>$2,200 /month</w:t>
+              <w:t>✓</w:t>
             </w:r>
           </w:p>
         </w:tc>
@@ -1360,7 +1368,7 @@
               <w:rPr>
                 <w:sz w:val="20"/>
               </w:rPr>
-              <w:t>Enterprise</w:t>
+              <w:t>Minor Feature Additions</w:t>
             </w:r>
           </w:p>
         </w:tc>
@@ -1374,7 +1382,7 @@
               <w:rPr>
                 <w:sz w:val="20"/>
               </w:rPr>
-              <w:t>All 13 algorithms</w:t>
+              <w:t>✓</w:t>
             </w:r>
           </w:p>
         </w:tc>
@@ -1388,7 +1396,315 @@
               <w:rPr>
                 <w:sz w:val="20"/>
               </w:rPr>
-              <w:t>$3,200 /month</w:t>
+              <w:t>✓</w:t>
+            </w:r>
+          </w:p>
+        </w:tc>
+      </w:tr>
+      <w:tr>
+        <w:tc>
+          <w:tcPr>
+            <w:tcW w:type="dxa" w:w="3135"/>
+          </w:tcPr>
+          <w:p>
+            <w:r/>
+            <w:r>
+              <w:rPr>
+                <w:sz w:val="20"/>
+              </w:rPr>
+              <w:t>Log Analysis Dashboard (www.bbaflighthub.com)</w:t>
+            </w:r>
+          </w:p>
+        </w:tc>
+        <w:tc>
+          <w:tcPr>
+            <w:tcW w:type="dxa" w:w="3135"/>
+          </w:tcPr>
+          <w:p>
+            <w:r/>
+            <w:r>
+              <w:rPr>
+                <w:sz w:val="20"/>
+              </w:rPr>
+              <w:t>✓</w:t>
+            </w:r>
+          </w:p>
+        </w:tc>
+        <w:tc>
+          <w:tcPr>
+            <w:tcW w:type="dxa" w:w="3135"/>
+          </w:tcPr>
+          <w:p>
+            <w:r/>
+            <w:r>
+              <w:rPr>
+                <w:sz w:val="20"/>
+              </w:rPr>
+              <w:t>✓</w:t>
+            </w:r>
+          </w:p>
+        </w:tc>
+      </w:tr>
+      <w:tr>
+        <w:tc>
+          <w:tcPr>
+            <w:tcW w:type="dxa" w:w="3135"/>
+          </w:tcPr>
+          <w:p>
+            <w:r/>
+            <w:r>
+              <w:rPr>
+                <w:sz w:val="20"/>
+              </w:rPr>
+              <w:t>Technical Support</w:t>
+            </w:r>
+          </w:p>
+        </w:tc>
+        <w:tc>
+          <w:tcPr>
+            <w:tcW w:type="dxa" w:w="3135"/>
+          </w:tcPr>
+          <w:p>
+            <w:r/>
+            <w:r>
+              <w:rPr>
+                <w:sz w:val="20"/>
+              </w:rPr>
+              <w:t>Email (48h)</w:t>
+            </w:r>
+          </w:p>
+        </w:tc>
+        <w:tc>
+          <w:tcPr>
+            <w:tcW w:type="dxa" w:w="3135"/>
+          </w:tcPr>
+          <w:p>
+            <w:r/>
+            <w:r>
+              <w:rPr>
+                <w:sz w:val="20"/>
+              </w:rPr>
+              <w:t>Priority (12h)</w:t>
+            </w:r>
+          </w:p>
+        </w:tc>
+      </w:tr>
+      <w:tr>
+        <w:tc>
+          <w:tcPr>
+            <w:tcW w:type="dxa" w:w="3135"/>
+          </w:tcPr>
+          <w:p>
+            <w:r/>
+            <w:r>
+              <w:rPr>
+                <w:sz w:val="20"/>
+              </w:rPr>
+              <w:t>AI Model Accuracy Updates</w:t>
+            </w:r>
+          </w:p>
+        </w:tc>
+        <w:tc>
+          <w:tcPr>
+            <w:tcW w:type="dxa" w:w="3135"/>
+          </w:tcPr>
+          <w:p>
+            <w:r/>
+            <w:r>
+              <w:rPr>
+                <w:sz w:val="20"/>
+              </w:rPr>
+              <w:t>2x per year</w:t>
+            </w:r>
+          </w:p>
+        </w:tc>
+        <w:tc>
+          <w:tcPr>
+            <w:tcW w:type="dxa" w:w="3135"/>
+          </w:tcPr>
+          <w:p>
+            <w:r/>
+            <w:r>
+              <w:rPr>
+                <w:sz w:val="20"/>
+              </w:rPr>
+              <w:t>Continuous</w:t>
+            </w:r>
+          </w:p>
+        </w:tc>
+      </w:tr>
+      <w:tr>
+        <w:tc>
+          <w:tcPr>
+            <w:tcW w:type="dxa" w:w="3135"/>
+          </w:tcPr>
+          <w:p>
+            <w:r/>
+            <w:r>
+              <w:rPr>
+                <w:sz w:val="20"/>
+              </w:rPr>
+              <w:t>New AI Model Versions</w:t>
+            </w:r>
+          </w:p>
+        </w:tc>
+        <w:tc>
+          <w:tcPr>
+            <w:tcW w:type="dxa" w:w="3135"/>
+          </w:tcPr>
+          <w:p>
+            <w:r/>
+            <w:r>
+              <w:rPr>
+                <w:sz w:val="20"/>
+              </w:rPr>
+              <w:t>—</w:t>
+            </w:r>
+          </w:p>
+        </w:tc>
+        <w:tc>
+          <w:tcPr>
+            <w:tcW w:type="dxa" w:w="3135"/>
+          </w:tcPr>
+          <w:p>
+            <w:r/>
+            <w:r>
+              <w:rPr>
+                <w:sz w:val="20"/>
+              </w:rPr>
+              <w:t>✓</w:t>
+            </w:r>
+          </w:p>
+        </w:tc>
+      </w:tr>
+      <w:tr>
+        <w:tc>
+          <w:tcPr>
+            <w:tcW w:type="dxa" w:w="3135"/>
+          </w:tcPr>
+          <w:p>
+            <w:r/>
+            <w:r>
+              <w:rPr>
+                <w:sz w:val="20"/>
+              </w:rPr>
+              <w:t>Major Feature Additions</w:t>
+            </w:r>
+          </w:p>
+        </w:tc>
+        <w:tc>
+          <w:tcPr>
+            <w:tcW w:type="dxa" w:w="3135"/>
+          </w:tcPr>
+          <w:p>
+            <w:r/>
+            <w:r>
+              <w:rPr>
+                <w:sz w:val="20"/>
+              </w:rPr>
+              <w:t>—</w:t>
+            </w:r>
+          </w:p>
+        </w:tc>
+        <w:tc>
+          <w:tcPr>
+            <w:tcW w:type="dxa" w:w="3135"/>
+          </w:tcPr>
+          <w:p>
+            <w:r/>
+            <w:r>
+              <w:rPr>
+                <w:sz w:val="20"/>
+              </w:rPr>
+              <w:t>✓</w:t>
+            </w:r>
+          </w:p>
+        </w:tc>
+      </w:tr>
+      <w:tr>
+        <w:tc>
+          <w:tcPr>
+            <w:tcW w:type="dxa" w:w="3135"/>
+          </w:tcPr>
+          <w:p>
+            <w:r/>
+            <w:r>
+              <w:rPr>
+                <w:sz w:val="20"/>
+              </w:rPr>
+              <w:t>Performance Optimization</w:t>
+            </w:r>
+          </w:p>
+        </w:tc>
+        <w:tc>
+          <w:tcPr>
+            <w:tcW w:type="dxa" w:w="3135"/>
+          </w:tcPr>
+          <w:p>
+            <w:r/>
+            <w:r>
+              <w:rPr>
+                <w:sz w:val="20"/>
+              </w:rPr>
+              <w:t>—</w:t>
+            </w:r>
+          </w:p>
+        </w:tc>
+        <w:tc>
+          <w:tcPr>
+            <w:tcW w:type="dxa" w:w="3135"/>
+          </w:tcPr>
+          <w:p>
+            <w:r/>
+            <w:r>
+              <w:rPr>
+                <w:sz w:val="20"/>
+              </w:rPr>
+              <w:t>✓</w:t>
+            </w:r>
+          </w:p>
+        </w:tc>
+      </w:tr>
+      <w:tr>
+        <w:tc>
+          <w:tcPr>
+            <w:tcW w:type="dxa" w:w="3135"/>
+          </w:tcPr>
+          <w:p>
+            <w:r/>
+            <w:r>
+              <w:rPr>
+                <w:sz w:val="20"/>
+              </w:rPr>
+              <w:t>Custom Model Training (Site-Specific)</w:t>
+            </w:r>
+          </w:p>
+        </w:tc>
+        <w:tc>
+          <w:tcPr>
+            <w:tcW w:type="dxa" w:w="3135"/>
+          </w:tcPr>
+          <w:p>
+            <w:r/>
+            <w:r>
+              <w:rPr>
+                <w:sz w:val="20"/>
+              </w:rPr>
+              <w:t>—</w:t>
+            </w:r>
+          </w:p>
+        </w:tc>
+        <w:tc>
+          <w:tcPr>
+            <w:tcW w:type="dxa" w:w="3135"/>
+          </w:tcPr>
+          <w:p>
+            <w:r/>
+            <w:r>
+              <w:rPr>
+                <w:sz w:val="20"/>
+              </w:rPr>
+              <w:t>✓</w:t>
             </w:r>
           </w:p>
         </w:tc>
@@ -1397,60 +1713,7 @@
     <w:p/>
     <w:p>
       <w:r>
-        <w:rPr>
-          <w:b/>
-        </w:rPr>
-        <w:t>One-time setup fee: $5,000</w:t>
-      </w:r>
-      <w:r>
-        <w:t xml:space="preserve"> (FH2 integration + 2 site deployment)</w:t>
-      </w:r>
-    </w:p>
-    <w:p/>
-    <w:p>
-      <w:r>
-        <w:rPr>
-          <w:b/>
-        </w:rPr>
-        <w:t>Subscription includes:</w:t>
-      </w:r>
-    </w:p>
-    <w:p>
-      <w:pPr>
-        <w:pStyle w:val="ListBullet"/>
-      </w:pPr>
-      <w:r>
-        <w:t>Continuous AI model updates and improvements</w:t>
-      </w:r>
-    </w:p>
-    <w:p>
-      <w:pPr>
-        <w:pStyle w:val="ListBullet"/>
-      </w:pPr>
-      <w:r>
-        <w:t>New algorithm versions as they are released</w:t>
-      </w:r>
-    </w:p>
-    <w:p>
-      <w:pPr>
-        <w:pStyle w:val="ListBullet"/>
-      </w:pPr>
-      <w:r>
-        <w:t>Technical support</w:t>
-      </w:r>
-    </w:p>
-    <w:p>
-      <w:pPr>
-        <w:pStyle w:val="ListBullet"/>
-      </w:pPr>
-      <w:r>
-        <w:t>Bug fixes</w:t>
-      </w:r>
-    </w:p>
-    <w:p/>
-    <w:p>
-      <w:r>
-        <w:t>If subscription is cancelled, the current version remains operational. Updates and support stop.</w:t>
+        <w:t>If maintenance plan is not renewed after the free period, the current version remains fully operational. Updates and new features stop.</w:t>
       </w:r>
     </w:p>
     <w:p/>
@@ -1462,12 +1725,12 @@
         <w:rPr>
           <w:color w:val="1A1A1A"/>
         </w:rPr>
-        <w:t>Important: GPU Recommendation</w:t>
+        <w:t>GPU Recommendation</w:t>
       </w:r>
     </w:p>
     <w:p>
       <w:r>
-        <w:t>The current Dell T2 is configured with NVIDIA RTX A1000 (4GB VRAM). Phase 1 and 2 algorithms can run on this GPU with optimizations. However, for optimal performance across all 13 algorithms, we recommend upgrading to NVIDIA RTX A2000 (12GB) or RTX A4000 (16GB).</w:t>
+        <w:t>The current Dell T2 is configured with NVIDIA RTX A1000 (4GB VRAM). Phase 1 and Phase 2 algorithms can run on this GPU with optimizations. For optimal performance across all 13 algorithms, we recommend upgrading to NVIDIA RTX A2000 (12GB) or RTX A4000 (16GB).</w:t>
       </w:r>
     </w:p>
     <w:p/>
@@ -1487,7 +1750,7 @@
         <w:rPr>
           <w:b/>
         </w:rPr>
-        <w:t>BBA is responsible for:</w:t>
+        <w:t>BBA delivers:</w:t>
       </w:r>
     </w:p>
     <w:p>
@@ -1495,7 +1758,7 @@
         <w:pStyle w:val="ListBullet"/>
       </w:pPr>
       <w:r>
-        <w:t>AI algorithm development and delivery</w:t>
+        <w:t>AI algorithm development and deployment</w:t>
       </w:r>
     </w:p>
     <w:p>
@@ -1511,15 +1774,7 @@
         <w:pStyle w:val="ListBullet"/>
       </w:pPr>
       <w:r>
-        <w:t>Docker container packaging</w:t>
-      </w:r>
-    </w:p>
-    <w:p>
-      <w:pPr>
-        <w:pStyle w:val="ListBullet"/>
-      </w:pPr>
-      <w:r>
-        <w:t>Remote deployment to 2 sites</w:t>
+        <w:t>Docker container packaging and remote deployment to 2 sites</w:t>
       </w:r>
     </w:p>
     <w:p/>
@@ -1528,7 +1783,7 @@
         <w:rPr>
           <w:b/>
         </w:rPr>
-        <w:t>BBA is NOT responsible for:</w:t>
+        <w:t>Out of BBA's scope:</w:t>
       </w:r>
     </w:p>
     <w:p>
@@ -1544,7 +1799,7 @@
         <w:pStyle w:val="ListBullet"/>
       </w:pPr>
       <w:r>
-        <w:t>FH2 integration if Cloud Algorithm API is not accessible</w:t>
+        <w:t>FH2 integration if Cloud Algorithm API access is not provided</w:t>
       </w:r>
     </w:p>
     <w:p>
@@ -1552,7 +1807,7 @@
         <w:pStyle w:val="ListBullet"/>
       </w:pPr>
       <w:r>
-        <w:t>Model accuracy if sample footage / labeled data is not provided</w:t>
+        <w:t>Model accuracy without sample footage or labeled data</w:t>
       </w:r>
     </w:p>
     <w:p>
@@ -1568,7 +1823,7 @@
         <w:pStyle w:val="ListBullet"/>
       </w:pPr>
       <w:r>
-        <w:t>Dell T2 server setup, OS, network configuration</w:t>
+        <w:t>Dell T2 server setup, OS, and network configuration</w:t>
       </w:r>
     </w:p>
     <w:p/>
@@ -1601,7 +1856,7 @@
         <w:pStyle w:val="ListBullet"/>
       </w:pPr>
       <w:r>
-        <w:t>Sample flight footage for model testing</w:t>
+        <w:t>Sample flight footage for model testing and fine-tuning</w:t>
       </w:r>
     </w:p>
     <w:p>
@@ -1609,7 +1864,267 @@
         <w:pStyle w:val="ListBullet"/>
       </w:pPr>
       <w:r>
-        <w:t>GPU upgrade recommendation: RTX A2000 or higher</w:t>
+        <w:t>GPU upgrade to RTX A2000 or higher (recommended)</w:t>
+      </w:r>
+    </w:p>
+    <w:p/>
+    <w:p>
+      <w:pPr>
+        <w:pStyle w:val="Heading1"/>
+      </w:pPr>
+      <w:r>
+        <w:rPr>
+          <w:color w:val="1A1A1A"/>
+        </w:rPr>
+        <w:t>Payment Terms</w:t>
+      </w:r>
+    </w:p>
+    <w:tbl>
+      <w:tblPr>
+        <w:tblStyle w:val="TableGrid"/>
+        <w:tblW w:type="auto" w:w="0"/>
+        <w:jc w:val="center"/>
+        <w:tblLook w:firstColumn="1" w:firstRow="1" w:lastColumn="0" w:lastRow="0" w:noHBand="0" w:noVBand="1" w:val="04A0"/>
+      </w:tblPr>
+      <w:tblGrid>
+        <w:gridCol w:w="3135"/>
+        <w:gridCol w:w="3135"/>
+        <w:gridCol w:w="3135"/>
+      </w:tblGrid>
+      <w:tr>
+        <w:tc>
+          <w:tcPr>
+            <w:tcW w:type="dxa" w:w="3135"/>
+            <w:shd w:fill="1A1A2A" w:val="clear"/>
+          </w:tcPr>
+          <w:p>
+            <w:r/>
+            <w:r>
+              <w:rPr>
+                <w:b/>
+                <w:color w:val="FFFFFF"/>
+                <w:sz w:val="20"/>
+              </w:rPr>
+              <w:t>Milestone</w:t>
+            </w:r>
+          </w:p>
+        </w:tc>
+        <w:tc>
+          <w:tcPr>
+            <w:tcW w:type="dxa" w:w="3135"/>
+            <w:shd w:fill="1A1A2A" w:val="clear"/>
+          </w:tcPr>
+          <w:p>
+            <w:r/>
+            <w:r>
+              <w:rPr>
+                <w:b/>
+                <w:color w:val="FFFFFF"/>
+                <w:sz w:val="20"/>
+              </w:rPr>
+              <w:t>Percentage</w:t>
+            </w:r>
+          </w:p>
+        </w:tc>
+        <w:tc>
+          <w:tcPr>
+            <w:tcW w:type="dxa" w:w="3135"/>
+            <w:shd w:fill="1A1A2A" w:val="clear"/>
+          </w:tcPr>
+          <w:p>
+            <w:r/>
+            <w:r>
+              <w:rPr>
+                <w:b/>
+                <w:color w:val="FFFFFF"/>
+                <w:sz w:val="20"/>
+              </w:rPr>
+              <w:t>Amount (Full Package)</w:t>
+            </w:r>
+          </w:p>
+        </w:tc>
+      </w:tr>
+      <w:tr>
+        <w:tc>
+          <w:tcPr>
+            <w:tcW w:type="dxa" w:w="3135"/>
+          </w:tcPr>
+          <w:p>
+            <w:r/>
+            <w:r>
+              <w:rPr>
+                <w:sz w:val="20"/>
+              </w:rPr>
+              <w:t>Contract Signing</w:t>
+            </w:r>
+          </w:p>
+        </w:tc>
+        <w:tc>
+          <w:tcPr>
+            <w:tcW w:type="dxa" w:w="3135"/>
+          </w:tcPr>
+          <w:p>
+            <w:r/>
+            <w:r>
+              <w:rPr>
+                <w:sz w:val="20"/>
+              </w:rPr>
+              <w:t>40%</w:t>
+            </w:r>
+          </w:p>
+        </w:tc>
+        <w:tc>
+          <w:tcPr>
+            <w:tcW w:type="dxa" w:w="3135"/>
+          </w:tcPr>
+          <w:p>
+            <w:r/>
+            <w:r>
+              <w:rPr>
+                <w:sz w:val="20"/>
+              </w:rPr>
+              <w:t>$12,800</w:t>
+            </w:r>
+          </w:p>
+        </w:tc>
+      </w:tr>
+      <w:tr>
+        <w:tc>
+          <w:tcPr>
+            <w:tcW w:type="dxa" w:w="3135"/>
+          </w:tcPr>
+          <w:p>
+            <w:r/>
+            <w:r>
+              <w:rPr>
+                <w:sz w:val="20"/>
+              </w:rPr>
+              <w:t>Phase 1 Deployment</w:t>
+            </w:r>
+          </w:p>
+        </w:tc>
+        <w:tc>
+          <w:tcPr>
+            <w:tcW w:type="dxa" w:w="3135"/>
+          </w:tcPr>
+          <w:p>
+            <w:r/>
+            <w:r>
+              <w:rPr>
+                <w:sz w:val="20"/>
+              </w:rPr>
+              <w:t>20%</w:t>
+            </w:r>
+          </w:p>
+        </w:tc>
+        <w:tc>
+          <w:tcPr>
+            <w:tcW w:type="dxa" w:w="3135"/>
+          </w:tcPr>
+          <w:p>
+            <w:r/>
+            <w:r>
+              <w:rPr>
+                <w:sz w:val="20"/>
+              </w:rPr>
+              <w:t>$6,400</w:t>
+            </w:r>
+          </w:p>
+        </w:tc>
+      </w:tr>
+      <w:tr>
+        <w:tc>
+          <w:tcPr>
+            <w:tcW w:type="dxa" w:w="3135"/>
+          </w:tcPr>
+          <w:p>
+            <w:r/>
+            <w:r>
+              <w:rPr>
+                <w:sz w:val="20"/>
+              </w:rPr>
+              <w:t>Phase 2 Deployment</w:t>
+            </w:r>
+          </w:p>
+        </w:tc>
+        <w:tc>
+          <w:tcPr>
+            <w:tcW w:type="dxa" w:w="3135"/>
+          </w:tcPr>
+          <w:p>
+            <w:r/>
+            <w:r>
+              <w:rPr>
+                <w:sz w:val="20"/>
+              </w:rPr>
+              <w:t>20%</w:t>
+            </w:r>
+          </w:p>
+        </w:tc>
+        <w:tc>
+          <w:tcPr>
+            <w:tcW w:type="dxa" w:w="3135"/>
+          </w:tcPr>
+          <w:p>
+            <w:r/>
+            <w:r>
+              <w:rPr>
+                <w:sz w:val="20"/>
+              </w:rPr>
+              <w:t>$6,400</w:t>
+            </w:r>
+          </w:p>
+        </w:tc>
+      </w:tr>
+      <w:tr>
+        <w:tc>
+          <w:tcPr>
+            <w:tcW w:type="dxa" w:w="3135"/>
+          </w:tcPr>
+          <w:p>
+            <w:r/>
+            <w:r>
+              <w:rPr>
+                <w:sz w:val="20"/>
+              </w:rPr>
+              <w:t>Phase 3 Deployment</w:t>
+            </w:r>
+          </w:p>
+        </w:tc>
+        <w:tc>
+          <w:tcPr>
+            <w:tcW w:type="dxa" w:w="3135"/>
+          </w:tcPr>
+          <w:p>
+            <w:r/>
+            <w:r>
+              <w:rPr>
+                <w:sz w:val="20"/>
+              </w:rPr>
+              <w:t>20%</w:t>
+            </w:r>
+          </w:p>
+        </w:tc>
+        <w:tc>
+          <w:tcPr>
+            <w:tcW w:type="dxa" w:w="3135"/>
+          </w:tcPr>
+          <w:p>
+            <w:r/>
+            <w:r>
+              <w:rPr>
+                <w:sz w:val="20"/>
+              </w:rPr>
+              <w:t>$6,400</w:t>
+            </w:r>
+          </w:p>
+        </w:tc>
+      </w:tr>
+    </w:tbl>
+    <w:p/>
+    <w:p>
+      <w:r>
+        <w:t>Payment is due within 14 days of each milestone completion. All prices are in USD. Maintenance plan billing starts after the 6-month free period.</w:t>
       </w:r>
     </w:p>
     <w:p/>
@@ -1627,13 +2142,19 @@
       <w:r>
         <w:rPr>
           <w:color w:val="B8922F"/>
+          <w:sz w:val="22"/>
         </w:rPr>
-        <w:t>BBA Teknoloji</w:t>
+        <w:t>BBA Tech</w:t>
       </w:r>
     </w:p>
     <w:p>
       <w:r>
+        <w:rPr>
+          <w:sz w:val="22"/>
+        </w:rPr>
         <w:t>serdarbatkan@bbateknoloji.com | +90 534 431 87 34</w:t>
+        <w:br/>
+        <w:t>www.bbaflighthub.com</w:t>
       </w:r>
     </w:p>
     <w:sectPr>

</xml_diff>